<commit_message>
feat: update user manual
</commit_message>
<xml_diff>
--- a/docs/Инструкция_пользователя_SEO_Seller.docx
+++ b/docs/Инструкция_пользователя_SEO_Seller.docx
@@ -1,6 +1,6 @@
 
 <file path=word/document.xml><?xml version="1.0" encoding="utf-8"?>
-<w:document xmlns:wpc="http://schemas.microsoft.com/office/word/2010/wordprocessingCanvas" xmlns:mc="http://schemas.openxmlformats.org/markup-compatibility/2006" xmlns:o="urn:schemas-microsoft-com:office:office" xmlns:r="http://schemas.openxmlformats.org/officeDocument/2006/relationships" xmlns:m="http://schemas.openxmlformats.org/officeDocument/2006/math" xmlns:v="urn:schemas-microsoft-com:vml" xmlns:wp14="http://schemas.microsoft.com/office/word/2010/wordprocessingDrawing" xmlns:wp="http://schemas.openxmlformats.org/drawingml/2006/wordprocessingDrawing" xmlns:w10="urn:schemas-microsoft-com:office:word" xmlns:w="http://schemas.openxmlformats.org/wordprocessingml/2006/main" xmlns:w14="http://schemas.microsoft.com/office/word/2010/wordml" xmlns:w15="http://schemas.microsoft.com/office/word/2012/wordml" xmlns:w16se="http://schemas.microsoft.com/office/word/2015/wordml/symex" xmlns:w16cid="http://schemas.microsoft.com/office/word/2016/wordml/cid" xmlns:w16="http://schemas.microsoft.com/office/word/2018/wordml" xmlns:w16cex="http://schemas.microsoft.com/office/word/2018/wordml/cex" xmlns:w16sdtdh="http://schemas.microsoft.com/office/word/2020/wordml/sdtdatahash" xmlns:wne="http://schemas.microsoft.com/office/word/2006/wordml" xmlns:wpg="http://schemas.microsoft.com/office/word/2010/wordprocessingGroup" xmlns:wps="http://schemas.microsoft.com/office/word/2010/wordprocessingShape" mc:Ignorable="w14 w15 w16se w16cid w16 w16cex w16sdtdh wp14">
+<w:document xmlns:wpc="http://schemas.microsoft.com/office/word/2010/wordprocessingCanvas" xmlns:mo="http://schemas.microsoft.com/office/mac/office/2008/main" xmlns:mc="http://schemas.openxmlformats.org/markup-compatibility/2006" xmlns:mv="urn:schemas-microsoft-com:mac:vml" xmlns:o="urn:schemas-microsoft-com:office:office" xmlns:r="http://schemas.openxmlformats.org/officeDocument/2006/relationships" xmlns:m="http://schemas.openxmlformats.org/officeDocument/2006/math" xmlns:v="urn:schemas-microsoft-com:vml" xmlns:wp14="http://schemas.microsoft.com/office/word/2010/wordprocessingDrawing" xmlns:wp="http://schemas.openxmlformats.org/drawingml/2006/wordprocessingDrawing" xmlns:w10="urn:schemas-microsoft-com:office:word" xmlns:w="http://schemas.openxmlformats.org/wordprocessingml/2006/main" xmlns:w14="http://schemas.microsoft.com/office/word/2010/wordml" xmlns:wpg="http://schemas.microsoft.com/office/word/2010/wordprocessingGroup" xmlns:wpi="http://schemas.microsoft.com/office/word/2010/wordprocessingInk" xmlns:wne="http://schemas.microsoft.com/office/word/2006/wordml" xmlns:wps="http://schemas.microsoft.com/office/word/2010/wordprocessingShape" mc:Ignorable="w14 wp14">
   <w:body>
     <w:p>
       <w:pPr>
@@ -8,12 +8,10 @@
       </w:pPr>
       <w:r>
         <w:rPr>
-          <w:rFonts w:ascii="Calibri" w:hAnsi="Calibri" w:eastAsia="Calibri" w:cs="Calibri" w:csTheme="minorBidi"/>
+          <w:rFonts w:ascii="Calibri" w:hAnsi="Calibri" w:eastAsia="Calibri"/>
           <w:b/>
-          <w:bCs/>
           <w:color w:val="1F3A5F"/>
           <w:sz w:val="40"/>
-          <w:szCs w:val="22"/>
         </w:rPr>
         <w:t>ИНСТРУКЦИЯ ПОЛЬЗОВАТЕЛЯ</w:t>
       </w:r>
@@ -24,25 +22,21 @@
       </w:pPr>
       <w:r>
         <w:rPr>
-          <w:rFonts w:ascii="Calibri" w:hAnsi="Calibri" w:eastAsia="Calibri" w:cs="Calibri" w:csTheme="minorBidi"/>
+          <w:rFonts w:ascii="Calibri" w:hAnsi="Calibri" w:eastAsia="Calibri"/>
+          <w:b w:val="0"/>
           <w:color w:val="5A6A7A"/>
           <w:sz w:val="24"/>
-          <w:szCs w:val="22"/>
         </w:rPr>
         <w:t>Пошаговое руководство · Участник 3</w:t>
       </w:r>
     </w:p>
     <w:p>
-      <w:pPr>
-        <w:spacing w:after="200" w:line="276" w:lineRule="auto"/>
-      </w:pPr>
       <w:r>
         <w:rPr>
-          <w:rFonts w:ascii="Calibri" w:hAnsi="Calibri" w:eastAsia="Calibri" w:cs="Calibri" w:csTheme="minorBidi"/>
+          <w:rFonts w:ascii="Calibri" w:hAnsi="Calibri" w:eastAsia="Calibri"/>
+          <w:b w:val="0"/>
           <w:i/>
-          <w:iCs/>
           <w:sz w:val="22"/>
-          <w:szCs w:val="22"/>
         </w:rPr>
         <w:t>Цель документа: любой человек, не знакомый с проектом, должен суметь пройти весь путь от первого входа до получения результата, используя только эту инструкцию.</w:t>
       </w:r>
@@ -53,12 +47,10 @@
       </w:pPr>
       <w:r>
         <w:rPr>
-          <w:rFonts w:ascii="Calibri" w:hAnsi="Calibri" w:eastAsia="Calibri" w:cs="Calibri" w:csTheme="majorBidi"/>
+          <w:rFonts w:ascii="Calibri" w:hAnsi="Calibri" w:eastAsia="Calibri"/>
           <w:b/>
-          <w:bCs/>
           <w:color w:val="1F3A5F"/>
           <w:sz w:val="32"/>
-          <w:szCs w:val="28"/>
         </w:rPr>
         <w:t>0. Введение</w:t>
       </w:r>
@@ -69,19 +61,17 @@
       </w:pPr>
       <w:r>
         <w:rPr>
-          <w:rFonts w:ascii="Calibri" w:hAnsi="Calibri" w:eastAsia="Calibri" w:cs="Calibri" w:csTheme="minorBidi"/>
+          <w:rFonts w:ascii="Calibri" w:hAnsi="Calibri" w:eastAsia="Calibri"/>
           <w:b/>
-          <w:bCs/>
           <w:sz w:val="24"/>
-          <w:szCs w:val="22"/>
         </w:rPr>
         <w:t xml:space="preserve">Название проекта: </w:t>
       </w:r>
       <w:r>
         <w:rPr>
-          <w:rFonts w:ascii="Calibri" w:hAnsi="Calibri" w:eastAsia="Calibri" w:cs="Calibri" w:csTheme="minorBidi"/>
+          <w:rFonts w:ascii="Calibri" w:hAnsi="Calibri" w:eastAsia="Calibri"/>
+          <w:b w:val="0"/>
           <w:sz w:val="24"/>
-          <w:szCs w:val="22"/>
         </w:rPr>
         <w:t>SEO Seller</w:t>
       </w:r>
@@ -92,19 +82,17 @@
       </w:pPr>
       <w:r>
         <w:rPr>
-          <w:rFonts w:ascii="Calibri" w:hAnsi="Calibri" w:eastAsia="Calibri" w:cs="Calibri" w:csTheme="minorBidi"/>
+          <w:rFonts w:ascii="Calibri" w:hAnsi="Calibri" w:eastAsia="Calibri"/>
           <w:b/>
-          <w:bCs/>
           <w:sz w:val="24"/>
-          <w:szCs w:val="22"/>
         </w:rPr>
         <w:t xml:space="preserve">Ссылка на работающий MVP: </w:t>
       </w:r>
       <w:r>
         <w:rPr>
-          <w:rFonts w:ascii="Calibri" w:hAnsi="Calibri" w:eastAsia="Calibri" w:cs="Calibri" w:csTheme="minorBidi"/>
+          <w:rFonts w:ascii="Calibri" w:hAnsi="Calibri" w:eastAsia="Calibri"/>
+          <w:b w:val="0"/>
           <w:sz w:val="24"/>
-          <w:szCs w:val="22"/>
         </w:rPr>
         <w:t>https://t.me/CardSEO_bot</w:t>
       </w:r>
@@ -115,19 +103,17 @@
       </w:pPr>
       <w:r>
         <w:rPr>
-          <w:rFonts w:ascii="Calibri" w:hAnsi="Calibri" w:eastAsia="Calibri" w:cs="Calibri" w:csTheme="minorBidi"/>
+          <w:rFonts w:ascii="Calibri" w:hAnsi="Calibri" w:eastAsia="Calibri"/>
           <w:b/>
-          <w:bCs/>
           <w:sz w:val="24"/>
-          <w:szCs w:val="22"/>
         </w:rPr>
         <w:t xml:space="preserve">Для кого этот продукт: </w:t>
       </w:r>
       <w:r>
         <w:rPr>
-          <w:rFonts w:ascii="Calibri" w:hAnsi="Calibri" w:eastAsia="Calibri" w:cs="Calibri" w:csTheme="minorBidi"/>
+          <w:rFonts w:ascii="Calibri" w:hAnsi="Calibri" w:eastAsia="Calibri"/>
+          <w:b w:val="0"/>
           <w:sz w:val="24"/>
-          <w:szCs w:val="22"/>
         </w:rPr>
         <w:t>Селлеры и контент-менеджеры, которые заполняют карточки на Wildberries, Ozon и Авито и не хотят каждый раз заново подгонять текст под лимиты площадки.</w:t>
       </w:r>
@@ -138,19 +124,17 @@
       </w:pPr>
       <w:r>
         <w:rPr>
-          <w:rFonts w:ascii="Calibri" w:hAnsi="Calibri" w:eastAsia="Calibri" w:cs="Calibri" w:csTheme="minorBidi"/>
+          <w:rFonts w:ascii="Calibri" w:hAnsi="Calibri" w:eastAsia="Calibri"/>
           <w:b/>
-          <w:bCs/>
           <w:sz w:val="24"/>
-          <w:szCs w:val="22"/>
         </w:rPr>
         <w:t xml:space="preserve">Что он делает: </w:t>
       </w:r>
       <w:r>
         <w:rPr>
-          <w:rFonts w:ascii="Calibri" w:hAnsi="Calibri" w:eastAsia="Calibri" w:cs="Calibri" w:csTheme="minorBidi"/>
+          <w:rFonts w:ascii="Calibri" w:hAnsi="Calibri" w:eastAsia="Calibri"/>
+          <w:b w:val="0"/>
           <w:sz w:val="24"/>
-          <w:szCs w:val="22"/>
         </w:rPr>
         <w:t>По фактам о товаре собирает готовый SEO-пакет: заголовок, описание, теги и характеристики под выбранную витрину.</w:t>
       </w:r>
@@ -161,19 +145,17 @@
       </w:pPr>
       <w:r>
         <w:rPr>
-          <w:rFonts w:ascii="Calibri" w:hAnsi="Calibri" w:eastAsia="Calibri" w:cs="Calibri" w:csTheme="minorBidi"/>
+          <w:rFonts w:ascii="Calibri" w:hAnsi="Calibri" w:eastAsia="Calibri"/>
           <w:b/>
-          <w:bCs/>
           <w:sz w:val="24"/>
-          <w:szCs w:val="22"/>
         </w:rPr>
         <w:t xml:space="preserve">Сколько времени займёт знакомство: </w:t>
       </w:r>
       <w:r>
         <w:rPr>
-          <w:rFonts w:ascii="Calibri" w:hAnsi="Calibri" w:eastAsia="Calibri" w:cs="Calibri" w:csTheme="minorBidi"/>
+          <w:rFonts w:ascii="Calibri" w:hAnsi="Calibri" w:eastAsia="Calibri"/>
+          <w:b w:val="0"/>
           <w:sz w:val="24"/>
-          <w:szCs w:val="22"/>
         </w:rPr>
         <w:t>3–5 минут до первого результата, если факты о товаре уже под рукой. Генерация обычно занимает от нескольких секунд до минуты.</w:t>
       </w:r>
@@ -184,90 +166,88 @@
       </w:pPr>
       <w:r>
         <w:rPr>
-          <w:rFonts w:ascii="Calibri" w:hAnsi="Calibri" w:eastAsia="Calibri" w:cs="Calibri" w:csTheme="majorBidi"/>
+          <w:rFonts w:ascii="Calibri" w:hAnsi="Calibri" w:eastAsia="Calibri"/>
           <w:b/>
-          <w:bCs/>
           <w:color w:val="1F3A5F"/>
           <w:sz w:val="32"/>
-          <w:szCs w:val="28"/>
         </w:rPr>
         <w:t>1. Первый вход в продукт</w:t>
       </w:r>
     </w:p>
     <w:p>
       <w:pPr>
-        <w:spacing w:before="0" w:after="160"/>
+        <w:spacing w:after="160" w:before="0"/>
       </w:pPr>
       <w:r>
         <w:rPr>
-          <w:rFonts w:ascii="Calibri" w:hAnsi="Calibri" w:eastAsia="Calibri" w:cs="Calibri" w:csTheme="minorBidi"/>
+          <w:rFonts w:ascii="Calibri" w:hAnsi="Calibri" w:eastAsia="Calibri"/>
+          <w:b w:val="0"/>
           <w:sz w:val="24"/>
-          <w:szCs w:val="22"/>
         </w:rPr>
         <w:t>Как попасть в продукт</w:t>
       </w:r>
     </w:p>
     <w:p>
       <w:pPr>
-        <w:spacing w:before="0" w:after="160"/>
+        <w:spacing w:after="160" w:before="0"/>
       </w:pPr>
       <w:r>
         <w:rPr>
-          <w:rFonts w:ascii="Calibri" w:hAnsi="Calibri" w:eastAsia="Calibri" w:cs="Calibri" w:csTheme="minorBidi"/>
+          <w:rFonts w:ascii="Calibri" w:hAnsi="Calibri" w:eastAsia="Calibri"/>
+          <w:b w:val="0"/>
           <w:sz w:val="24"/>
-          <w:szCs w:val="22"/>
         </w:rPr>
         <w:t>Откройте Telegram и перейдите по ссылке https://t.me/CardSEO_bot либо найдите бота по имени SEO Seller (@CardSEO_bot). Нажмите «Start Bot» / «Запустить» — откроется чат с ботом.</w:t>
       </w:r>
     </w:p>
     <w:p>
       <w:pPr>
-        <w:spacing w:before="0" w:after="160"/>
+        <w:spacing w:after="160" w:before="0"/>
       </w:pPr>
       <w:r>
         <w:rPr>
-          <w:rFonts w:ascii="Calibri" w:hAnsi="Calibri" w:eastAsia="Calibri" w:cs="Calibri" w:csTheme="minorBidi"/>
+          <w:rFonts w:ascii="Calibri" w:hAnsi="Calibri" w:eastAsia="Calibri"/>
+          <w:b w:val="0"/>
           <w:sz w:val="24"/>
-          <w:szCs w:val="22"/>
         </w:rPr>
         <w:t>Что нужно сделать на старте</w:t>
       </w:r>
     </w:p>
     <w:p>
       <w:pPr>
-        <w:spacing w:before="0" w:after="160"/>
+        <w:spacing w:after="160" w:before="0"/>
       </w:pPr>
       <w:r>
         <w:rPr>
-          <w:rFonts w:ascii="Calibri" w:hAnsi="Calibri" w:eastAsia="Calibri" w:cs="Calibri" w:csTheme="minorBidi"/>
+          <w:rFonts w:ascii="Calibri" w:hAnsi="Calibri" w:eastAsia="Calibri"/>
+          <w:b w:val="0"/>
           <w:sz w:val="24"/>
-          <w:szCs w:val="22"/>
         </w:rPr>
         <w:t>Регистрация в продукте не нужна. Отдельный логин, почта и карта не запрашиваются. Достаточно аккаунта Telegram. Сразу после входа ничего заполнять не требуется: отправьте команду /start.</w:t>
       </w:r>
     </w:p>
     <w:p>
       <w:pPr>
-        <w:spacing w:before="0" w:after="160"/>
+        <w:spacing w:after="160" w:before="0"/>
       </w:pPr>
       <w:r>
         <w:rPr>
-          <w:rFonts w:ascii="Calibri" w:hAnsi="Calibri" w:eastAsia="Calibri" w:cs="Calibri" w:csTheme="minorBidi"/>
+          <w:rFonts w:ascii="Calibri" w:hAnsi="Calibri" w:eastAsia="Calibri"/>
+          <w:b w:val="0"/>
           <w:sz w:val="24"/>
-          <w:szCs w:val="22"/>
         </w:rPr>
         <w:t>Что пользователь увидит первым</w:t>
       </w:r>
     </w:p>
     <w:p>
       <w:pPr>
-        <w:spacing w:before="0" w:after="160"/>
+        <w:spacing w:after="160" w:before="0"/>
       </w:pPr>
       <w:r>
         <w:rPr>
-          <w:rFonts w:ascii="Calibri" w:hAnsi="Calibri" w:eastAsia="Calibri" w:cs="Calibri" w:csTheme="minorBidi"/>
+          <w:rFonts w:ascii="Calibri" w:hAnsi="Calibri" w:eastAsia="Calibri"/>
+          <w:b w:val="0"/>
           <w:sz w:val="24"/>
-          <w:szCs w:val="22"/>
         </w:rPr>
         <w:t>Бот приветствует коротко: «Готовый SEO-пакет для Wildberries, Ozon и Авито за пару минут: заголовок, описание и теги под лимиты площадки.» Ниже — три кнопки площадок: Wildberries, Ozon, Авито. Это и есть главный экран. Кабинета, корзины и ленты заказов нет: весь сценарий живёт в одном чате.</w:t>
       </w:r>
@@ -279,22 +259,21 @@
       </w:pPr>
       <w:r>
         <w:drawing>
-          <wp:inline distT="0" distB="0" distL="0" distR="0">
-            <wp:extent cx="4143375" cy="4019550"/>
-            <wp:effectExtent l="0" t="0" r="0" b="0"/>
-            <wp:docPr id="100000" name="Picture 100000"/>
+          <wp:inline xmlns:a="http://schemas.openxmlformats.org/drawingml/2006/main" xmlns:pic="http://schemas.openxmlformats.org/drawingml/2006/picture">
+            <wp:extent cx="4140000" cy="4023327"/>
+            <wp:docPr id="1" name="Picture 1"/>
             <wp:cNvGraphicFramePr>
-              <a:graphicFrameLocks xmlns:a="http://schemas.openxmlformats.org/drawingml/2006/main" noChangeAspect="1"/>
+              <a:graphicFrameLocks noChangeAspect="1"/>
             </wp:cNvGraphicFramePr>
-            <a:graphic xmlns:a="http://schemas.openxmlformats.org/drawingml/2006/main">
+            <a:graphic>
               <a:graphicData uri="http://schemas.openxmlformats.org/drawingml/2006/picture">
-                <pic:pic xmlns:pic="http://schemas.openxmlformats.org/drawingml/2006/picture">
+                <pic:pic>
                   <pic:nvPicPr>
-                    <pic:cNvPr id="100000" name="image100000"/>
+                    <pic:cNvPr id="0" name="01_vhod_v_bota.png"/>
                     <pic:cNvPicPr/>
                   </pic:nvPicPr>
                   <pic:blipFill>
-                    <a:blip r:embed="rId16"/>
+                    <a:blip r:embed="rId9"/>
                     <a:stretch>
                       <a:fillRect/>
                     </a:stretch>
@@ -302,11 +281,9 @@
                   <pic:spPr>
                     <a:xfrm>
                       <a:off x="0" y="0"/>
-                      <a:ext cx="4143375" cy="4019550"/>
+                      <a:ext cx="4140000" cy="4023327"/>
                     </a:xfrm>
-                    <a:prstGeom prst="rect">
-                      <a:avLst/>
-                    </a:prstGeom>
+                    <a:prstGeom prst="rect"/>
                   </pic:spPr>
                 </pic:pic>
               </a:graphicData>
@@ -322,11 +299,10 @@
       </w:pPr>
       <w:r>
         <w:rPr>
-          <w:rFonts w:ascii="Calibri" w:hAnsi="Calibri" w:eastAsia="Calibri" w:cs="Calibri" w:csTheme="minorBidi"/>
+          <w:rFonts w:ascii="Calibri" w:hAnsi="Calibri" w:eastAsia="Calibri"/>
+          <w:b w:val="0"/>
           <w:i/>
-          <w:iCs/>
           <w:sz w:val="20"/>
-          <w:szCs w:val="22"/>
         </w:rPr>
         <w:t>Рисунок 1. Страница входа в SEO Seller: имя бота и кнопка запуска.</w:t>
       </w:r>
@@ -338,22 +314,21 @@
       </w:pPr>
       <w:r>
         <w:drawing>
-          <wp:inline distT="0" distB="0" distL="0" distR="0">
-            <wp:extent cx="4143375" cy="2933700"/>
-            <wp:effectExtent l="0" t="0" r="0" b="0"/>
-            <wp:docPr id="100001" name="Picture 100001"/>
+          <wp:inline xmlns:a="http://schemas.openxmlformats.org/drawingml/2006/main" xmlns:pic="http://schemas.openxmlformats.org/drawingml/2006/picture">
+            <wp:extent cx="4140000" cy="2932500"/>
+            <wp:docPr id="2" name="Picture 2"/>
             <wp:cNvGraphicFramePr>
-              <a:graphicFrameLocks xmlns:a="http://schemas.openxmlformats.org/drawingml/2006/main" noChangeAspect="1"/>
+              <a:graphicFrameLocks noChangeAspect="1"/>
             </wp:cNvGraphicFramePr>
-            <a:graphic xmlns:a="http://schemas.openxmlformats.org/drawingml/2006/main">
+            <a:graphic>
               <a:graphicData uri="http://schemas.openxmlformats.org/drawingml/2006/picture">
-                <pic:pic xmlns:pic="http://schemas.openxmlformats.org/drawingml/2006/picture">
+                <pic:pic>
                   <pic:nvPicPr>
-                    <pic:cNvPr id="100001" name="image100001"/>
+                    <pic:cNvPr id="0" name="02_start.png"/>
                     <pic:cNvPicPr/>
                   </pic:nvPicPr>
                   <pic:blipFill>
-                    <a:blip r:embed="rId17"/>
+                    <a:blip r:embed="rId10"/>
                     <a:stretch>
                       <a:fillRect/>
                     </a:stretch>
@@ -361,11 +336,9 @@
                   <pic:spPr>
                     <a:xfrm>
                       <a:off x="0" y="0"/>
-                      <a:ext cx="4143375" cy="2933700"/>
+                      <a:ext cx="4140000" cy="2932500"/>
                     </a:xfrm>
-                    <a:prstGeom prst="rect">
-                      <a:avLst/>
-                    </a:prstGeom>
+                    <a:prstGeom prst="rect"/>
                   </pic:spPr>
                 </pic:pic>
               </a:graphicData>
@@ -381,11 +354,10 @@
       </w:pPr>
       <w:r>
         <w:rPr>
-          <w:rFonts w:ascii="Calibri" w:hAnsi="Calibri" w:eastAsia="Calibri" w:cs="Calibri" w:csTheme="minorBidi"/>
+          <w:rFonts w:ascii="Calibri" w:hAnsi="Calibri" w:eastAsia="Calibri"/>
+          <w:b w:val="0"/>
           <w:i/>
-          <w:iCs/>
           <w:sz w:val="20"/>
-          <w:szCs w:val="22"/>
         </w:rPr>
         <w:t>Рисунок 2. Стартовый экран после /start: приветствие и выбор площадки.</w:t>
       </w:r>
@@ -396,12 +368,10 @@
       </w:pPr>
       <w:r>
         <w:rPr>
-          <w:rFonts w:ascii="Calibri" w:hAnsi="Calibri" w:eastAsia="Calibri" w:cs="Calibri" w:csTheme="majorBidi"/>
+          <w:rFonts w:ascii="Calibri" w:hAnsi="Calibri" w:eastAsia="Calibri"/>
           <w:b/>
-          <w:bCs/>
           <w:color w:val="1F3A5F"/>
           <w:sz w:val="32"/>
-          <w:szCs w:val="28"/>
         </w:rPr>
         <w:t>2. Основная функция №1. Собрать SEO-пакет под площадку</w:t>
       </w:r>
@@ -412,19 +382,17 @@
       </w:pPr>
       <w:r>
         <w:rPr>
-          <w:rFonts w:ascii="Calibri" w:hAnsi="Calibri" w:eastAsia="Calibri" w:cs="Calibri" w:csTheme="minorBidi"/>
+          <w:rFonts w:ascii="Calibri" w:hAnsi="Calibri" w:eastAsia="Calibri"/>
           <w:b/>
-          <w:bCs/>
           <w:sz w:val="24"/>
-          <w:szCs w:val="22"/>
         </w:rPr>
         <w:t xml:space="preserve">Название функции: </w:t>
       </w:r>
       <w:r>
         <w:rPr>
-          <w:rFonts w:ascii="Calibri" w:hAnsi="Calibri" w:eastAsia="Calibri" w:cs="Calibri" w:csTheme="minorBidi"/>
+          <w:rFonts w:ascii="Calibri" w:hAnsi="Calibri" w:eastAsia="Calibri"/>
+          <w:b w:val="0"/>
           <w:sz w:val="24"/>
-          <w:szCs w:val="22"/>
         </w:rPr>
         <w:t>Генерация SEO-пакета под выбранную площадку</w:t>
       </w:r>
@@ -435,97 +403,95 @@
       </w:pPr>
       <w:r>
         <w:rPr>
-          <w:rFonts w:ascii="Calibri" w:hAnsi="Calibri" w:eastAsia="Calibri" w:cs="Calibri" w:csTheme="minorBidi"/>
+          <w:rFonts w:ascii="Calibri" w:hAnsi="Calibri" w:eastAsia="Calibri"/>
           <w:b/>
-          <w:bCs/>
           <w:sz w:val="24"/>
-          <w:szCs w:val="22"/>
         </w:rPr>
         <w:t xml:space="preserve">Зачем она нужна пользователю: </w:t>
       </w:r>
       <w:r>
         <w:rPr>
-          <w:rFonts w:ascii="Calibri" w:hAnsi="Calibri" w:eastAsia="Calibri" w:cs="Calibri" w:csTheme="minorBidi"/>
+          <w:rFonts w:ascii="Calibri" w:hAnsi="Calibri" w:eastAsia="Calibri"/>
+          <w:b w:val="0"/>
           <w:sz w:val="24"/>
-          <w:szCs w:val="22"/>
         </w:rPr>
         <w:t>Закрывает самую частую боль селлера — написать карточку с нуля и не вылезти за лимиты. Wildberries режет название на 60 символах, у Ozon описание почти не участвует в поиске, на Авито в ленте видны первые строки. Бот держит эти правила и отдаёт черновик, который можно сразу вставить в карточку. В кабинеты маркетплейсов он ничего не публикует.</w:t>
       </w:r>
     </w:p>
     <w:p>
       <w:pPr>
-        <w:spacing w:before="0" w:after="160"/>
+        <w:spacing w:after="160" w:before="0"/>
       </w:pPr>
       <w:r>
         <w:rPr>
-          <w:rFonts w:ascii="Calibri" w:hAnsi="Calibri" w:eastAsia="Calibri" w:cs="Calibri" w:csTheme="minorBidi"/>
+          <w:rFonts w:ascii="Calibri" w:hAnsi="Calibri" w:eastAsia="Calibri"/>
+          <w:b w:val="0"/>
           <w:sz w:val="24"/>
-          <w:szCs w:val="22"/>
         </w:rPr>
         <w:t>Пошаговая инструкция</w:t>
       </w:r>
     </w:p>
     <w:p>
       <w:pPr>
-        <w:spacing w:before="0" w:after="160"/>
+        <w:spacing w:after="160" w:before="0"/>
       </w:pPr>
       <w:r>
         <w:rPr>
-          <w:rFonts w:ascii="Calibri" w:hAnsi="Calibri" w:eastAsia="Calibri" w:cs="Calibri" w:csTheme="minorBidi"/>
+          <w:rFonts w:ascii="Calibri" w:hAnsi="Calibri" w:eastAsia="Calibri"/>
+          <w:b w:val="0"/>
           <w:sz w:val="24"/>
-          <w:szCs w:val="22"/>
         </w:rPr>
         <w:t>1. Пользователь открывает бота и отправляет /start.</w:t>
       </w:r>
     </w:p>
     <w:p>
       <w:pPr>
-        <w:spacing w:before="0" w:after="160"/>
+        <w:spacing w:after="160" w:before="0"/>
       </w:pPr>
       <w:r>
         <w:rPr>
-          <w:rFonts w:ascii="Calibri" w:hAnsi="Calibri" w:eastAsia="Calibri" w:cs="Calibri" w:csTheme="minorBidi"/>
+          <w:rFonts w:ascii="Calibri" w:hAnsi="Calibri" w:eastAsia="Calibri"/>
+          <w:b w:val="0"/>
           <w:sz w:val="24"/>
-          <w:szCs w:val="22"/>
         </w:rPr>
         <w:t>2. Затем нажимает кнопку площадки — например, Wildberries.</w:t>
       </w:r>
     </w:p>
     <w:p>
       <w:pPr>
-        <w:spacing w:before="0" w:after="160"/>
+        <w:spacing w:after="160" w:before="0"/>
       </w:pPr>
       <w:r>
         <w:rPr>
-          <w:rFonts w:ascii="Calibri" w:hAnsi="Calibri" w:eastAsia="Calibri" w:cs="Calibri" w:csTheme="minorBidi"/>
+          <w:rFonts w:ascii="Calibri" w:hAnsi="Calibri" w:eastAsia="Calibri"/>
+          <w:b w:val="0"/>
           <w:sz w:val="24"/>
-          <w:szCs w:val="22"/>
         </w:rPr>
         <w:t>3. Присылает факты о товаре списком (тип, бренд, материал, цвет, для кого, повод). Фото можно приложить или пропустить кнопкой «Без фото».</w:t>
       </w:r>
     </w:p>
     <w:p>
       <w:pPr>
-        <w:spacing w:before="0" w:after="160"/>
+        <w:spacing w:after="160" w:before="0"/>
       </w:pPr>
       <w:r>
         <w:rPr>
-          <w:rFonts w:ascii="Calibri" w:hAnsi="Calibri" w:eastAsia="Calibri" w:cs="Calibri" w:csTheme="minorBidi"/>
+          <w:rFonts w:ascii="Calibri" w:hAnsi="Calibri" w:eastAsia="Calibri"/>
+          <w:b w:val="0"/>
           <w:sz w:val="24"/>
-          <w:szCs w:val="22"/>
         </w:rPr>
         <w:t>4. Система обрабатывает запрос: на экране появляется статус «Собираю SEO-пакет…». Обычно это 5–40 секунд, иногда до минуты.</w:t>
       </w:r>
     </w:p>
     <w:p>
       <w:pPr>
-        <w:spacing w:before="0" w:after="160"/>
+        <w:spacing w:after="160" w:before="0"/>
       </w:pPr>
       <w:r>
         <w:rPr>
-          <w:rFonts w:ascii="Calibri" w:hAnsi="Calibri" w:eastAsia="Calibri" w:cs="Calibri" w:csTheme="minorBidi"/>
+          <w:rFonts w:ascii="Calibri" w:hAnsi="Calibri" w:eastAsia="Calibri"/>
+          <w:b w:val="0"/>
           <w:sz w:val="24"/>
-          <w:szCs w:val="22"/>
         </w:rPr>
         <w:t>5. Пользователь получает пакет: заголовок со счётчиком символов, описание, теги и характеристики — плюс кнопки копирования.</w:t>
       </w:r>
@@ -536,110 +502,45 @@
       </w:pPr>
       <w:r>
         <w:rPr>
-          <w:rFonts w:ascii="Calibri" w:hAnsi="Calibri" w:eastAsia="Calibri" w:cs="Calibri" w:csTheme="minorBidi"/>
+          <w:rFonts w:ascii="Calibri" w:hAnsi="Calibri" w:eastAsia="Calibri"/>
           <w:b/>
-          <w:bCs/>
           <w:sz w:val="24"/>
-          <w:szCs w:val="22"/>
         </w:rPr>
         <w:t xml:space="preserve">Пример входных данных: </w:t>
       </w:r>
       <w:r>
         <w:rPr>
-          <w:rFonts w:ascii="Calibri" w:hAnsi="Calibri" w:eastAsia="Calibri" w:cs="Calibri" w:csTheme="minorBidi"/>
+          <w:rFonts w:ascii="Calibri" w:hAnsi="Calibri" w:eastAsia="Calibri"/>
+          <w:b w:val="0"/>
           <w:sz w:val="24"/>
-          <w:szCs w:val="22"/>
         </w:rPr>
         <w:t>текст фактов. Фото необязательно. Файл и ссылка на кабинет не нужны.</w:t>
       </w:r>
     </w:p>
     <w:p>
       <w:pPr>
-        <w:spacing w:before="0" w:after="160"/>
+        <w:spacing w:after="160" w:before="0"/>
       </w:pPr>
       <w:r>
         <w:rPr>
-          <w:rFonts w:ascii="Calibri" w:hAnsi="Calibri" w:eastAsia="Calibri" w:cs="Calibri" w:csTheme="minorBidi"/>
+          <w:rFonts w:ascii="Calibri" w:hAnsi="Calibri" w:eastAsia="Calibri"/>
+          <w:b w:val="0"/>
           <w:sz w:val="24"/>
-          <w:szCs w:val="22"/>
         </w:rPr>
         <w:t>Худи мужское</w:t>
-      </w:r>
-      <w:r>
-        <w:br w:type="textWrapping"/>
-      </w:r>
-      <w:r>
-        <w:rPr>
-          <w:rFonts w:ascii="Calibri" w:hAnsi="Calibri" w:eastAsia="Calibri" w:cs="Calibri" w:csTheme="minorBidi"/>
-          <w:sz w:val="24"/>
-          <w:szCs w:val="22"/>
-        </w:rPr>
+        <w:br/>
         <w:t>Бренд: Nordveil</w:t>
-      </w:r>
-      <w:r>
-        <w:br w:type="textWrapping"/>
-      </w:r>
-      <w:r>
-        <w:rPr>
-          <w:rFonts w:ascii="Calibri" w:hAnsi="Calibri" w:eastAsia="Calibri" w:cs="Calibri" w:csTheme="minorBidi"/>
-          <w:sz w:val="24"/>
-          <w:szCs w:val="22"/>
-        </w:rPr>
+        <w:br/>
         <w:t>Материал: хлопок 80%, полиэстер 20%</w:t>
-      </w:r>
-      <w:r>
-        <w:br w:type="textWrapping"/>
-      </w:r>
-      <w:r>
-        <w:rPr>
-          <w:rFonts w:ascii="Calibri" w:hAnsi="Calibri" w:eastAsia="Calibri" w:cs="Calibri" w:csTheme="minorBidi"/>
-          <w:sz w:val="24"/>
-          <w:szCs w:val="22"/>
-        </w:rPr>
+        <w:br/>
         <w:t>Цвет: чёрный</w:t>
-      </w:r>
-      <w:r>
-        <w:br w:type="textWrapping"/>
-      </w:r>
-      <w:r>
-        <w:rPr>
-          <w:rFonts w:ascii="Calibri" w:hAnsi="Calibri" w:eastAsia="Calibri" w:cs="Calibri" w:csTheme="minorBidi"/>
-          <w:sz w:val="24"/>
-          <w:szCs w:val="22"/>
-        </w:rPr>
+        <w:br/>
         <w:t>Крой: оверсайз</w:t>
-      </w:r>
-      <w:r>
-        <w:br w:type="textWrapping"/>
-      </w:r>
-      <w:r>
-        <w:rPr>
-          <w:rFonts w:ascii="Calibri" w:hAnsi="Calibri" w:eastAsia="Calibri" w:cs="Calibri" w:csTheme="minorBidi"/>
-          <w:sz w:val="24"/>
-          <w:szCs w:val="22"/>
-        </w:rPr>
+        <w:br/>
         <w:t>Для кого: мужчины 25-40</w:t>
-      </w:r>
-      <w:r>
-        <w:br w:type="textWrapping"/>
-      </w:r>
-      <w:r>
-        <w:rPr>
-          <w:rFonts w:ascii="Calibri" w:hAnsi="Calibri" w:eastAsia="Calibri" w:cs="Calibri" w:csTheme="minorBidi"/>
-          <w:sz w:val="24"/>
-          <w:szCs w:val="22"/>
-        </w:rPr>
+        <w:br/>
         <w:t>Повод: повседневная носка, подарок коллеге</w:t>
-      </w:r>
-      <w:r>
-        <w:br w:type="textWrapping"/>
-      </w:r>
-      <w:r>
-        <w:rPr>
-          <w:rFonts w:ascii="Calibri" w:hAnsi="Calibri" w:eastAsia="Calibri" w:cs="Calibri" w:csTheme="minorBidi"/>
-          <w:sz w:val="24"/>
-          <w:szCs w:val="22"/>
-        </w:rPr>
+        <w:br/>
         <w:t>Детали: капюшон, карман кенгуру</w:t>
       </w:r>
     </w:p>
@@ -649,71 +550,69 @@
       </w:pPr>
       <w:r>
         <w:rPr>
-          <w:rFonts w:ascii="Calibri" w:hAnsi="Calibri" w:eastAsia="Calibri" w:cs="Calibri" w:csTheme="minorBidi"/>
+          <w:rFonts w:ascii="Calibri" w:hAnsi="Calibri" w:eastAsia="Calibri"/>
           <w:b/>
-          <w:bCs/>
           <w:sz w:val="24"/>
-          <w:szCs w:val="22"/>
         </w:rPr>
         <w:t xml:space="preserve">Пример результата: </w:t>
       </w:r>
       <w:r>
         <w:rPr>
-          <w:rFonts w:ascii="Calibri" w:hAnsi="Calibri" w:eastAsia="Calibri" w:cs="Calibri" w:csTheme="minorBidi"/>
+          <w:rFonts w:ascii="Calibri" w:hAnsi="Calibri" w:eastAsia="Calibri"/>
+          <w:b w:val="0"/>
           <w:sz w:val="24"/>
-          <w:szCs w:val="22"/>
         </w:rPr>
         <w:t>готовый пакет для Wildberries.</w:t>
       </w:r>
     </w:p>
     <w:p>
       <w:pPr>
-        <w:spacing w:before="0" w:after="160"/>
+        <w:spacing w:after="160" w:before="0"/>
       </w:pPr>
       <w:r>
         <w:rPr>
-          <w:rFonts w:ascii="Calibri" w:hAnsi="Calibri" w:eastAsia="Calibri" w:cs="Calibri" w:csTheme="minorBidi"/>
+          <w:rFonts w:ascii="Calibri" w:hAnsi="Calibri" w:eastAsia="Calibri"/>
+          <w:b w:val="0"/>
           <w:sz w:val="24"/>
-          <w:szCs w:val="22"/>
         </w:rPr>
         <w:t>Заголовок: «Худи мужское оверсайз хлопок капюшон чёрное» (47 из 60 символов).</w:t>
       </w:r>
     </w:p>
     <w:p>
       <w:pPr>
-        <w:spacing w:before="0" w:after="160"/>
+        <w:spacing w:after="160" w:before="0"/>
       </w:pPr>
       <w:r>
         <w:rPr>
-          <w:rFonts w:ascii="Calibri" w:hAnsi="Calibri" w:eastAsia="Calibri" w:cs="Calibri" w:csTheme="minorBidi"/>
+          <w:rFonts w:ascii="Calibri" w:hAnsi="Calibri" w:eastAsia="Calibri"/>
+          <w:b w:val="0"/>
           <w:sz w:val="24"/>
-          <w:szCs w:val="22"/>
         </w:rPr>
         <w:t>Описание: живой текст для покупателя — что это, кому подойдёт, как носить, как ухаживать. Состав только из ввода, без выдуманных сертификатов.</w:t>
       </w:r>
     </w:p>
     <w:p>
       <w:pPr>
-        <w:spacing w:before="0" w:after="160"/>
+        <w:spacing w:after="160" w:before="0"/>
       </w:pPr>
       <w:r>
         <w:rPr>
-          <w:rFonts w:ascii="Calibri" w:hAnsi="Calibri" w:eastAsia="Calibri" w:cs="Calibri" w:csTheme="minorBidi"/>
+          <w:rFonts w:ascii="Calibri" w:hAnsi="Calibri" w:eastAsia="Calibri"/>
+          <w:b w:val="0"/>
           <w:sz w:val="24"/>
-          <w:szCs w:val="22"/>
         </w:rPr>
         <w:t>Теги: худи мужское; оверсайз; хлопок; с капюшоном; карман кенгуру; повседневное; подарок коллеге; подарок мужчине.</w:t>
       </w:r>
     </w:p>
     <w:p>
       <w:pPr>
-        <w:spacing w:before="0" w:after="160"/>
+        <w:spacing w:after="160" w:before="0"/>
       </w:pPr>
       <w:r>
         <w:rPr>
-          <w:rFonts w:ascii="Calibri" w:hAnsi="Calibri" w:eastAsia="Calibri" w:cs="Calibri" w:csTheme="minorBidi"/>
+          <w:rFonts w:ascii="Calibri" w:hAnsi="Calibri" w:eastAsia="Calibri"/>
+          <w:b w:val="0"/>
           <w:sz w:val="24"/>
-          <w:szCs w:val="22"/>
         </w:rPr>
         <w:t>Характеристики: мужской, оверсайз, хлопок, чёрный, капюшон, подарок коллеге.</w:t>
       </w:r>
@@ -725,22 +624,21 @@
       </w:pPr>
       <w:r>
         <w:drawing>
-          <wp:inline distT="0" distB="0" distL="0" distR="0">
-            <wp:extent cx="4143375" cy="4448175"/>
-            <wp:effectExtent l="0" t="0" r="0" b="0"/>
-            <wp:docPr id="100002" name="Picture 100002"/>
+          <wp:inline xmlns:a="http://schemas.openxmlformats.org/drawingml/2006/main" xmlns:pic="http://schemas.openxmlformats.org/drawingml/2006/picture">
+            <wp:extent cx="4140000" cy="4450500"/>
+            <wp:docPr id="3" name="Picture 3"/>
             <wp:cNvGraphicFramePr>
-              <a:graphicFrameLocks xmlns:a="http://schemas.openxmlformats.org/drawingml/2006/main" noChangeAspect="1"/>
+              <a:graphicFrameLocks noChangeAspect="1"/>
             </wp:cNvGraphicFramePr>
-            <a:graphic xmlns:a="http://schemas.openxmlformats.org/drawingml/2006/main">
+            <a:graphic>
               <a:graphicData uri="http://schemas.openxmlformats.org/drawingml/2006/picture">
-                <pic:pic xmlns:pic="http://schemas.openxmlformats.org/drawingml/2006/picture">
+                <pic:pic>
                   <pic:nvPicPr>
-                    <pic:cNvPr id="100002" name="image100002"/>
+                    <pic:cNvPr id="0" name="03_vybor_ploshchadki.png"/>
                     <pic:cNvPicPr/>
                   </pic:nvPicPr>
                   <pic:blipFill>
-                    <a:blip r:embed="rId18"/>
+                    <a:blip r:embed="rId11"/>
                     <a:stretch>
                       <a:fillRect/>
                     </a:stretch>
@@ -748,11 +646,9 @@
                   <pic:spPr>
                     <a:xfrm>
                       <a:off x="0" y="0"/>
-                      <a:ext cx="4143375" cy="4448175"/>
+                      <a:ext cx="4140000" cy="4450500"/>
                     </a:xfrm>
-                    <a:prstGeom prst="rect">
-                      <a:avLst/>
-                    </a:prstGeom>
+                    <a:prstGeom prst="rect"/>
                   </pic:spPr>
                 </pic:pic>
               </a:graphicData>
@@ -768,11 +664,10 @@
       </w:pPr>
       <w:r>
         <w:rPr>
-          <w:rFonts w:ascii="Calibri" w:hAnsi="Calibri" w:eastAsia="Calibri" w:cs="Calibri" w:csTheme="minorBidi"/>
+          <w:rFonts w:ascii="Calibri" w:hAnsi="Calibri" w:eastAsia="Calibri"/>
+          <w:b w:val="0"/>
           <w:i/>
-          <w:iCs/>
           <w:sz w:val="20"/>
-          <w:szCs w:val="22"/>
         </w:rPr>
         <w:t>Рисунок 3. Выбор Wildberries и ввод фактов о товаре.</w:t>
       </w:r>
@@ -784,22 +679,21 @@
       </w:pPr>
       <w:r>
         <w:drawing>
-          <wp:inline distT="0" distB="0" distL="0" distR="0">
-            <wp:extent cx="4143375" cy="1057275"/>
-            <wp:effectExtent l="0" t="0" r="0" b="0"/>
-            <wp:docPr id="100003" name="Picture 100003"/>
+          <wp:inline xmlns:a="http://schemas.openxmlformats.org/drawingml/2006/main" xmlns:pic="http://schemas.openxmlformats.org/drawingml/2006/picture">
+            <wp:extent cx="4140000" cy="1058000"/>
+            <wp:docPr id="4" name="Picture 4"/>
             <wp:cNvGraphicFramePr>
-              <a:graphicFrameLocks xmlns:a="http://schemas.openxmlformats.org/drawingml/2006/main" noChangeAspect="1"/>
+              <a:graphicFrameLocks noChangeAspect="1"/>
             </wp:cNvGraphicFramePr>
-            <a:graphic xmlns:a="http://schemas.openxmlformats.org/drawingml/2006/main">
+            <a:graphic>
               <a:graphicData uri="http://schemas.openxmlformats.org/drawingml/2006/picture">
-                <pic:pic xmlns:pic="http://schemas.openxmlformats.org/drawingml/2006/picture">
+                <pic:pic>
                   <pic:nvPicPr>
-                    <pic:cNvPr id="100003" name="image100003"/>
+                    <pic:cNvPr id="0" name="04_ozhidanie.png"/>
                     <pic:cNvPicPr/>
                   </pic:nvPicPr>
                   <pic:blipFill>
-                    <a:blip r:embed="rId19"/>
+                    <a:blip r:embed="rId12"/>
                     <a:stretch>
                       <a:fillRect/>
                     </a:stretch>
@@ -807,11 +701,9 @@
                   <pic:spPr>
                     <a:xfrm>
                       <a:off x="0" y="0"/>
-                      <a:ext cx="4143375" cy="1057275"/>
+                      <a:ext cx="4140000" cy="1058000"/>
                     </a:xfrm>
-                    <a:prstGeom prst="rect">
-                      <a:avLst/>
-                    </a:prstGeom>
+                    <a:prstGeom prst="rect"/>
                   </pic:spPr>
                 </pic:pic>
               </a:graphicData>
@@ -827,11 +719,10 @@
       </w:pPr>
       <w:r>
         <w:rPr>
-          <w:rFonts w:ascii="Calibri" w:hAnsi="Calibri" w:eastAsia="Calibri" w:cs="Calibri" w:csTheme="minorBidi"/>
+          <w:rFonts w:ascii="Calibri" w:hAnsi="Calibri" w:eastAsia="Calibri"/>
+          <w:b w:val="0"/>
           <w:i/>
-          <w:iCs/>
           <w:sz w:val="20"/>
-          <w:szCs w:val="22"/>
         </w:rPr>
         <w:t>Рисунок 4. Ожидание: бот собирает SEO-пакет.</w:t>
       </w:r>
@@ -843,22 +734,21 @@
       </w:pPr>
       <w:r>
         <w:drawing>
-          <wp:inline distT="0" distB="0" distL="0" distR="0">
-            <wp:extent cx="4143375" cy="5972175"/>
-            <wp:effectExtent l="0" t="0" r="0" b="0"/>
-            <wp:docPr id="100004" name="Picture 100004"/>
+          <wp:inline xmlns:a="http://schemas.openxmlformats.org/drawingml/2006/main" xmlns:pic="http://schemas.openxmlformats.org/drawingml/2006/picture">
+            <wp:extent cx="4140000" cy="5968500"/>
+            <wp:docPr id="5" name="Picture 5"/>
             <wp:cNvGraphicFramePr>
-              <a:graphicFrameLocks xmlns:a="http://schemas.openxmlformats.org/drawingml/2006/main" noChangeAspect="1"/>
+              <a:graphicFrameLocks noChangeAspect="1"/>
             </wp:cNvGraphicFramePr>
-            <a:graphic xmlns:a="http://schemas.openxmlformats.org/drawingml/2006/main">
+            <a:graphic>
               <a:graphicData uri="http://schemas.openxmlformats.org/drawingml/2006/picture">
-                <pic:pic xmlns:pic="http://schemas.openxmlformats.org/drawingml/2006/picture">
+                <pic:pic>
                   <pic:nvPicPr>
-                    <pic:cNvPr id="100004" name="image100004"/>
+                    <pic:cNvPr id="0" name="05_seo_paket.png"/>
                     <pic:cNvPicPr/>
                   </pic:nvPicPr>
                   <pic:blipFill>
-                    <a:blip r:embed="rId20"/>
+                    <a:blip r:embed="rId13"/>
                     <a:stretch>
                       <a:fillRect/>
                     </a:stretch>
@@ -866,11 +756,9 @@
                   <pic:spPr>
                     <a:xfrm>
                       <a:off x="0" y="0"/>
-                      <a:ext cx="4143375" cy="5972175"/>
+                      <a:ext cx="4140000" cy="5968500"/>
                     </a:xfrm>
-                    <a:prstGeom prst="rect">
-                      <a:avLst/>
-                    </a:prstGeom>
+                    <a:prstGeom prst="rect"/>
                   </pic:spPr>
                 </pic:pic>
               </a:graphicData>
@@ -886,11 +774,10 @@
       </w:pPr>
       <w:r>
         <w:rPr>
-          <w:rFonts w:ascii="Calibri" w:hAnsi="Calibri" w:eastAsia="Calibri" w:cs="Calibri" w:csTheme="minorBidi"/>
+          <w:rFonts w:ascii="Calibri" w:hAnsi="Calibri" w:eastAsia="Calibri"/>
+          <w:b w:val="0"/>
           <w:i/>
-          <w:iCs/>
           <w:sz w:val="20"/>
-          <w:szCs w:val="22"/>
         </w:rPr>
         <w:t>Рисунок 5. Результат core-функции: пакет с кнопками копирования.</w:t>
       </w:r>
@@ -901,12 +788,10 @@
       </w:pPr>
       <w:r>
         <w:rPr>
-          <w:rFonts w:ascii="Calibri" w:hAnsi="Calibri" w:eastAsia="Calibri" w:cs="Calibri" w:csTheme="majorBidi"/>
+          <w:rFonts w:ascii="Calibri" w:hAnsi="Calibri" w:eastAsia="Calibri"/>
           <w:b/>
-          <w:bCs/>
           <w:color w:val="1F3A5F"/>
           <w:sz w:val="32"/>
-          <w:szCs w:val="28"/>
         </w:rPr>
         <w:t>3. Основная функция №2. Пересобрать тот же товар под другую площадку</w:t>
       </w:r>
@@ -917,19 +802,17 @@
       </w:pPr>
       <w:r>
         <w:rPr>
-          <w:rFonts w:ascii="Calibri" w:hAnsi="Calibri" w:eastAsia="Calibri" w:cs="Calibri" w:csTheme="minorBidi"/>
+          <w:rFonts w:ascii="Calibri" w:hAnsi="Calibri" w:eastAsia="Calibri"/>
           <w:b/>
-          <w:bCs/>
           <w:sz w:val="24"/>
-          <w:szCs w:val="22"/>
         </w:rPr>
         <w:t xml:space="preserve">Название функции: </w:t>
       </w:r>
       <w:r>
         <w:rPr>
-          <w:rFonts w:ascii="Calibri" w:hAnsi="Calibri" w:eastAsia="Calibri" w:cs="Calibri" w:csTheme="minorBidi"/>
+          <w:rFonts w:ascii="Calibri" w:hAnsi="Calibri" w:eastAsia="Calibri"/>
+          <w:b w:val="0"/>
           <w:sz w:val="24"/>
-          <w:szCs w:val="22"/>
         </w:rPr>
         <w:t>Пересборка пакета под другую витрину без повторного ввода</w:t>
       </w:r>
@@ -940,71 +823,69 @@
       </w:pPr>
       <w:r>
         <w:rPr>
-          <w:rFonts w:ascii="Calibri" w:hAnsi="Calibri" w:eastAsia="Calibri" w:cs="Calibri" w:csTheme="minorBidi"/>
+          <w:rFonts w:ascii="Calibri" w:hAnsi="Calibri" w:eastAsia="Calibri"/>
           <w:b/>
-          <w:bCs/>
           <w:sz w:val="24"/>
-          <w:szCs w:val="22"/>
         </w:rPr>
         <w:t xml:space="preserve">Зачем она нужна: </w:t>
       </w:r>
       <w:r>
         <w:rPr>
-          <w:rFonts w:ascii="Calibri" w:hAnsi="Calibri" w:eastAsia="Calibri" w:cs="Calibri" w:csTheme="minorBidi"/>
+          <w:rFonts w:ascii="Calibri" w:hAnsi="Calibri" w:eastAsia="Calibri"/>
+          <w:b w:val="0"/>
           <w:sz w:val="24"/>
-          <w:szCs w:val="22"/>
         </w:rPr>
         <w:t>Один товар часто продают сразу на нескольких площадках. Не нужно заново набирать факты: бот берёт тот же ввод и переписывает текст под другие лимиты и правила поиска.</w:t>
       </w:r>
     </w:p>
     <w:p>
       <w:pPr>
-        <w:spacing w:before="0" w:after="160"/>
+        <w:spacing w:after="160" w:before="0"/>
       </w:pPr>
       <w:r>
         <w:rPr>
-          <w:rFonts w:ascii="Calibri" w:hAnsi="Calibri" w:eastAsia="Calibri" w:cs="Calibri" w:csTheme="minorBidi"/>
+          <w:rFonts w:ascii="Calibri" w:hAnsi="Calibri" w:eastAsia="Calibri"/>
+          <w:b w:val="0"/>
           <w:sz w:val="24"/>
-          <w:szCs w:val="22"/>
         </w:rPr>
         <w:t>Пошаговая инструкция</w:t>
       </w:r>
     </w:p>
     <w:p>
       <w:pPr>
-        <w:spacing w:before="0" w:after="160"/>
+        <w:spacing w:after="160" w:before="0"/>
       </w:pPr>
       <w:r>
         <w:rPr>
-          <w:rFonts w:ascii="Calibri" w:hAnsi="Calibri" w:eastAsia="Calibri" w:cs="Calibri" w:csTheme="minorBidi"/>
+          <w:rFonts w:ascii="Calibri" w:hAnsi="Calibri" w:eastAsia="Calibri"/>
+          <w:b w:val="0"/>
           <w:sz w:val="24"/>
-          <w:szCs w:val="22"/>
         </w:rPr>
         <w:t>1. После готового пакета нажмите «Другая площадка».</w:t>
       </w:r>
     </w:p>
     <w:p>
       <w:pPr>
-        <w:spacing w:before="0" w:after="160"/>
+        <w:spacing w:after="160" w:before="0"/>
       </w:pPr>
       <w:r>
         <w:rPr>
-          <w:rFonts w:ascii="Calibri" w:hAnsi="Calibri" w:eastAsia="Calibri" w:cs="Calibri" w:csTheme="minorBidi"/>
+          <w:rFonts w:ascii="Calibri" w:hAnsi="Calibri" w:eastAsia="Calibri"/>
+          <w:b w:val="0"/>
           <w:sz w:val="24"/>
-          <w:szCs w:val="22"/>
         </w:rPr>
         <w:t>2. Выберите витрину, которой ещё не было — например, Ozon. Текущая кнопка скрывается.</w:t>
       </w:r>
     </w:p>
     <w:p>
       <w:pPr>
-        <w:spacing w:before="0" w:after="160"/>
+        <w:spacing w:after="160" w:before="0"/>
       </w:pPr>
       <w:r>
         <w:rPr>
-          <w:rFonts w:ascii="Calibri" w:hAnsi="Calibri" w:eastAsia="Calibri" w:cs="Calibri" w:csTheme="minorBidi"/>
+          <w:rFonts w:ascii="Calibri" w:hAnsi="Calibri" w:eastAsia="Calibri"/>
+          <w:b w:val="0"/>
           <w:sz w:val="24"/>
-          <w:szCs w:val="22"/>
         </w:rPr>
         <w:t>3. Дождитесь нового пакета. Факты и фото подставляются автоматически.</w:t>
       </w:r>
@@ -1015,19 +896,17 @@
       </w:pPr>
       <w:r>
         <w:rPr>
-          <w:rFonts w:ascii="Calibri" w:hAnsi="Calibri" w:eastAsia="Calibri" w:cs="Calibri" w:csTheme="minorBidi"/>
+          <w:rFonts w:ascii="Calibri" w:hAnsi="Calibri" w:eastAsia="Calibri"/>
           <w:b/>
-          <w:bCs/>
           <w:sz w:val="24"/>
-          <w:szCs w:val="22"/>
         </w:rPr>
         <w:t xml:space="preserve">Пример входных данных: </w:t>
       </w:r>
       <w:r>
         <w:rPr>
-          <w:rFonts w:ascii="Calibri" w:hAnsi="Calibri" w:eastAsia="Calibri" w:cs="Calibri" w:csTheme="minorBidi"/>
+          <w:rFonts w:ascii="Calibri" w:hAnsi="Calibri" w:eastAsia="Calibri"/>
+          <w:b w:val="0"/>
           <w:sz w:val="24"/>
-          <w:szCs w:val="22"/>
         </w:rPr>
         <w:t>те же факты худи Nordveil, без повторного набора.</w:t>
       </w:r>
@@ -1038,19 +917,17 @@
       </w:pPr>
       <w:r>
         <w:rPr>
-          <w:rFonts w:ascii="Calibri" w:hAnsi="Calibri" w:eastAsia="Calibri" w:cs="Calibri" w:csTheme="minorBidi"/>
+          <w:rFonts w:ascii="Calibri" w:hAnsi="Calibri" w:eastAsia="Calibri"/>
           <w:b/>
-          <w:bCs/>
           <w:sz w:val="24"/>
-          <w:szCs w:val="22"/>
         </w:rPr>
         <w:t xml:space="preserve">Пример выходных данных: </w:t>
       </w:r>
       <w:r>
         <w:rPr>
-          <w:rFonts w:ascii="Calibri" w:hAnsi="Calibri" w:eastAsia="Calibri" w:cs="Calibri" w:csTheme="minorBidi"/>
+          <w:rFonts w:ascii="Calibri" w:hAnsi="Calibri" w:eastAsia="Calibri"/>
+          <w:b w:val="0"/>
           <w:sz w:val="24"/>
-          <w:szCs w:val="22"/>
         </w:rPr>
         <w:t>для Ozon заголовок длиннее и содержит бренд: «Худи мужское оверсайз хлопок капюшон карман кенгуру чёрное Nordveil». Теги и характеристики становятся опорой для поиска, потому что описание Ozon почти не индексирует.</w:t>
       </w:r>
@@ -1062,22 +939,21 @@
       </w:pPr>
       <w:r>
         <w:drawing>
-          <wp:inline distT="0" distB="0" distL="0" distR="0">
-            <wp:extent cx="4143375" cy="3933825"/>
-            <wp:effectExtent l="0" t="0" r="0" b="0"/>
-            <wp:docPr id="100005" name="Picture 100005"/>
+          <wp:inline xmlns:a="http://schemas.openxmlformats.org/drawingml/2006/main" xmlns:pic="http://schemas.openxmlformats.org/drawingml/2006/picture">
+            <wp:extent cx="4140000" cy="3933000"/>
+            <wp:docPr id="6" name="Picture 6"/>
             <wp:cNvGraphicFramePr>
-              <a:graphicFrameLocks xmlns:a="http://schemas.openxmlformats.org/drawingml/2006/main" noChangeAspect="1"/>
+              <a:graphicFrameLocks noChangeAspect="1"/>
             </wp:cNvGraphicFramePr>
-            <a:graphic xmlns:a="http://schemas.openxmlformats.org/drawingml/2006/main">
+            <a:graphic>
               <a:graphicData uri="http://schemas.openxmlformats.org/drawingml/2006/picture">
-                <pic:pic xmlns:pic="http://schemas.openxmlformats.org/drawingml/2006/picture">
+                <pic:pic>
                   <pic:nvPicPr>
-                    <pic:cNvPr id="100005" name="image100005"/>
+                    <pic:cNvPr id="0" name="06_drugaya_ploshchadka.png"/>
                     <pic:cNvPicPr/>
                   </pic:nvPicPr>
                   <pic:blipFill>
-                    <a:blip r:embed="rId21"/>
+                    <a:blip r:embed="rId14"/>
                     <a:stretch>
                       <a:fillRect/>
                     </a:stretch>
@@ -1085,11 +961,9 @@
                   <pic:spPr>
                     <a:xfrm>
                       <a:off x="0" y="0"/>
-                      <a:ext cx="4143375" cy="3933825"/>
+                      <a:ext cx="4140000" cy="3933000"/>
                     </a:xfrm>
-                    <a:prstGeom prst="rect">
-                      <a:avLst/>
-                    </a:prstGeom>
+                    <a:prstGeom prst="rect"/>
                   </pic:spPr>
                 </pic:pic>
               </a:graphicData>
@@ -1105,11 +979,10 @@
       </w:pPr>
       <w:r>
         <w:rPr>
-          <w:rFonts w:ascii="Calibri" w:hAnsi="Calibri" w:eastAsia="Calibri" w:cs="Calibri" w:csTheme="minorBidi"/>
+          <w:rFonts w:ascii="Calibri" w:hAnsi="Calibri" w:eastAsia="Calibri"/>
+          <w:b w:val="0"/>
           <w:i/>
-          <w:iCs/>
           <w:sz w:val="20"/>
-          <w:szCs w:val="22"/>
         </w:rPr>
         <w:t>Рисунок 6. Пересборка того же товара под Ozon.</w:t>
       </w:r>
@@ -1120,12 +993,10 @@
       </w:pPr>
       <w:r>
         <w:rPr>
-          <w:rFonts w:ascii="Calibri" w:hAnsi="Calibri" w:eastAsia="Calibri" w:cs="Calibri" w:csTheme="majorBidi"/>
+          <w:rFonts w:ascii="Calibri" w:hAnsi="Calibri" w:eastAsia="Calibri"/>
           <w:b/>
-          <w:bCs/>
           <w:color w:val="1F3A5F"/>
           <w:sz w:val="32"/>
-          <w:szCs w:val="28"/>
         </w:rPr>
         <w:t>4. Основная функция №3. Скопировать поля и получить другой вариант текста</w:t>
       </w:r>
@@ -1136,19 +1007,17 @@
       </w:pPr>
       <w:r>
         <w:rPr>
-          <w:rFonts w:ascii="Calibri" w:hAnsi="Calibri" w:eastAsia="Calibri" w:cs="Calibri" w:csTheme="minorBidi"/>
+          <w:rFonts w:ascii="Calibri" w:hAnsi="Calibri" w:eastAsia="Calibri"/>
           <w:b/>
-          <w:bCs/>
           <w:sz w:val="24"/>
-          <w:szCs w:val="22"/>
         </w:rPr>
         <w:t xml:space="preserve">Название функции: </w:t>
       </w:r>
       <w:r>
         <w:rPr>
-          <w:rFonts w:ascii="Calibri" w:hAnsi="Calibri" w:eastAsia="Calibri" w:cs="Calibri" w:csTheme="minorBidi"/>
+          <w:rFonts w:ascii="Calibri" w:hAnsi="Calibri" w:eastAsia="Calibri"/>
+          <w:b w:val="0"/>
           <w:sz w:val="24"/>
-          <w:szCs w:val="22"/>
         </w:rPr>
         <w:t>Копирование полей и перегенерация формулировок</w:t>
       </w:r>
@@ -1159,71 +1028,69 @@
       </w:pPr>
       <w:r>
         <w:rPr>
-          <w:rFonts w:ascii="Calibri" w:hAnsi="Calibri" w:eastAsia="Calibri" w:cs="Calibri" w:csTheme="minorBidi"/>
+          <w:rFonts w:ascii="Calibri" w:hAnsi="Calibri" w:eastAsia="Calibri"/>
           <w:b/>
-          <w:bCs/>
           <w:sz w:val="24"/>
-          <w:szCs w:val="22"/>
         </w:rPr>
         <w:t xml:space="preserve">Зачем она нужна: </w:t>
       </w:r>
       <w:r>
         <w:rPr>
-          <w:rFonts w:ascii="Calibri" w:hAnsi="Calibri" w:eastAsia="Calibri" w:cs="Calibri" w:csTheme="minorBidi"/>
+          <w:rFonts w:ascii="Calibri" w:hAnsi="Calibri" w:eastAsia="Calibri"/>
+          <w:b w:val="0"/>
           <w:sz w:val="24"/>
-          <w:szCs w:val="22"/>
         </w:rPr>
         <w:t>Это завершение цикла: текст не остаётся в чате «для чтения», его можно сразу унести в карточку. Если тон не зашёл — другой угол без смены товара. Так селлер закрывает задачу: получил, выбрал, вставил.</w:t>
       </w:r>
     </w:p>
     <w:p>
       <w:pPr>
-        <w:spacing w:before="0" w:after="160"/>
+        <w:spacing w:after="160" w:before="0"/>
       </w:pPr>
       <w:r>
         <w:rPr>
-          <w:rFonts w:ascii="Calibri" w:hAnsi="Calibri" w:eastAsia="Calibri" w:cs="Calibri" w:csTheme="minorBidi"/>
+          <w:rFonts w:ascii="Calibri" w:hAnsi="Calibri" w:eastAsia="Calibri"/>
+          <w:b w:val="0"/>
           <w:sz w:val="24"/>
-          <w:szCs w:val="22"/>
         </w:rPr>
         <w:t>Пошаговая инструкция</w:t>
       </w:r>
     </w:p>
     <w:p>
       <w:pPr>
-        <w:spacing w:before="0" w:after="160"/>
+        <w:spacing w:after="160" w:before="0"/>
       </w:pPr>
       <w:r>
         <w:rPr>
-          <w:rFonts w:ascii="Calibri" w:hAnsi="Calibri" w:eastAsia="Calibri" w:cs="Calibri" w:csTheme="minorBidi"/>
+          <w:rFonts w:ascii="Calibri" w:hAnsi="Calibri" w:eastAsia="Calibri"/>
+          <w:b w:val="0"/>
           <w:sz w:val="24"/>
-          <w:szCs w:val="22"/>
         </w:rPr>
         <w:t>1. Нажмите «Копировать заголовок», «Копировать описание», «Копировать теги» или «Копировать всё». Короткое поле сразу попадает в буфер. Если текст длиннее лимита кнопки Telegram (256 символов), бот пришлёт его отдельным сообщением — скопируйте из чата.</w:t>
       </w:r>
     </w:p>
     <w:p>
       <w:pPr>
-        <w:spacing w:before="0" w:after="160"/>
+        <w:spacing w:after="160" w:before="0"/>
       </w:pPr>
       <w:r>
         <w:rPr>
-          <w:rFonts w:ascii="Calibri" w:hAnsi="Calibri" w:eastAsia="Calibri" w:cs="Calibri" w:csTheme="minorBidi"/>
+          <w:rFonts w:ascii="Calibri" w:hAnsi="Calibri" w:eastAsia="Calibri"/>
+          <w:b w:val="0"/>
           <w:sz w:val="24"/>
-          <w:szCs w:val="22"/>
         </w:rPr>
         <w:t>2. Если формулировка не подошла, нажмите «Перегенерировать». Бот напишет тот же товар иначе: другой акцент, без дословного повтора.</w:t>
       </w:r>
     </w:p>
     <w:p>
       <w:pPr>
-        <w:spacing w:before="0" w:after="160"/>
+        <w:spacing w:after="160" w:before="0"/>
       </w:pPr>
       <w:r>
         <w:rPr>
-          <w:rFonts w:ascii="Calibri" w:hAnsi="Calibri" w:eastAsia="Calibri" w:cs="Calibri" w:csTheme="minorBidi"/>
+          <w:rFonts w:ascii="Calibri" w:hAnsi="Calibri" w:eastAsia="Calibri"/>
+          <w:b w:val="0"/>
           <w:sz w:val="24"/>
-          <w:szCs w:val="22"/>
         </w:rPr>
         <w:t>3. Для следующего SKU нажмите «Новый товар» — диалог начнётся с выбора площадки.</w:t>
       </w:r>
@@ -1234,19 +1101,17 @@
       </w:pPr>
       <w:r>
         <w:rPr>
-          <w:rFonts w:ascii="Calibri" w:hAnsi="Calibri" w:eastAsia="Calibri" w:cs="Calibri" w:csTheme="minorBidi"/>
+          <w:rFonts w:ascii="Calibri" w:hAnsi="Calibri" w:eastAsia="Calibri"/>
           <w:b/>
-          <w:bCs/>
           <w:sz w:val="24"/>
-          <w:szCs w:val="22"/>
         </w:rPr>
         <w:t xml:space="preserve">Пример результата: </w:t>
       </w:r>
       <w:r>
         <w:rPr>
-          <w:rFonts w:ascii="Calibri" w:hAnsi="Calibri" w:eastAsia="Calibri" w:cs="Calibri" w:csTheme="minorBidi"/>
+          <w:rFonts w:ascii="Calibri" w:hAnsi="Calibri" w:eastAsia="Calibri"/>
+          <w:b w:val="0"/>
           <w:sz w:val="24"/>
-          <w:szCs w:val="22"/>
         </w:rPr>
         <w:t>заголовок в буфере обмена; либо новый вариант описания того же худи с акцентом на подарок коллеге. Состав и бренд по-прежнему только из исходных фактов.</w:t>
       </w:r>
@@ -1258,22 +1123,21 @@
       </w:pPr>
       <w:r>
         <w:drawing>
-          <wp:inline distT="0" distB="0" distL="0" distR="0">
-            <wp:extent cx="4143375" cy="2990850"/>
-            <wp:effectExtent l="0" t="0" r="0" b="0"/>
-            <wp:docPr id="100006" name="Picture 100006"/>
+          <wp:inline xmlns:a="http://schemas.openxmlformats.org/drawingml/2006/main" xmlns:pic="http://schemas.openxmlformats.org/drawingml/2006/picture">
+            <wp:extent cx="4140000" cy="2990000"/>
+            <wp:docPr id="7" name="Picture 7"/>
             <wp:cNvGraphicFramePr>
-              <a:graphicFrameLocks xmlns:a="http://schemas.openxmlformats.org/drawingml/2006/main" noChangeAspect="1"/>
+              <a:graphicFrameLocks noChangeAspect="1"/>
             </wp:cNvGraphicFramePr>
-            <a:graphic xmlns:a="http://schemas.openxmlformats.org/drawingml/2006/main">
+            <a:graphic>
               <a:graphicData uri="http://schemas.openxmlformats.org/drawingml/2006/picture">
-                <pic:pic xmlns:pic="http://schemas.openxmlformats.org/drawingml/2006/picture">
+                <pic:pic>
                   <pic:nvPicPr>
-                    <pic:cNvPr id="100006" name="image100006"/>
+                    <pic:cNvPr id="0" name="07_kopirovanie.png"/>
                     <pic:cNvPicPr/>
                   </pic:nvPicPr>
                   <pic:blipFill>
-                    <a:blip r:embed="rId22"/>
+                    <a:blip r:embed="rId15"/>
                     <a:stretch>
                       <a:fillRect/>
                     </a:stretch>
@@ -1281,11 +1145,9 @@
                   <pic:spPr>
                     <a:xfrm>
                       <a:off x="0" y="0"/>
-                      <a:ext cx="4143375" cy="2990850"/>
+                      <a:ext cx="4140000" cy="2990000"/>
                     </a:xfrm>
-                    <a:prstGeom prst="rect">
-                      <a:avLst/>
-                    </a:prstGeom>
+                    <a:prstGeom prst="rect"/>
                   </pic:spPr>
                 </pic:pic>
               </a:graphicData>
@@ -1301,11 +1163,10 @@
       </w:pPr>
       <w:r>
         <w:rPr>
-          <w:rFonts w:ascii="Calibri" w:hAnsi="Calibri" w:eastAsia="Calibri" w:cs="Calibri" w:csTheme="minorBidi"/>
+          <w:rFonts w:ascii="Calibri" w:hAnsi="Calibri" w:eastAsia="Calibri"/>
+          <w:b w:val="0"/>
           <w:i/>
-          <w:iCs/>
           <w:sz w:val="20"/>
-          <w:szCs w:val="22"/>
         </w:rPr>
         <w:t>Рисунок 7. Копирование полей и перегенерация формулировок.</w:t>
       </w:r>
@@ -1316,12 +1177,10 @@
       </w:pPr>
       <w:r>
         <w:rPr>
-          <w:rFonts w:ascii="Calibri" w:hAnsi="Calibri" w:eastAsia="Calibri" w:cs="Calibri" w:csTheme="majorBidi"/>
+          <w:rFonts w:ascii="Calibri" w:hAnsi="Calibri" w:eastAsia="Calibri"/>
           <w:b/>
-          <w:bCs/>
           <w:color w:val="1F3A5F"/>
           <w:sz w:val="32"/>
-          <w:szCs w:val="28"/>
         </w:rPr>
         <w:t>5. Что делать, если что-то пошло не так</w:t>
       </w:r>
@@ -1332,21 +1191,19 @@
       </w:pPr>
       <w:r>
         <w:rPr>
-          <w:rFonts w:ascii="Calibri" w:hAnsi="Calibri" w:eastAsia="Calibri" w:cs="Calibri" w:csTheme="minorBidi"/>
+          <w:rFonts w:ascii="Calibri" w:hAnsi="Calibri" w:eastAsia="Calibri"/>
           <w:b/>
-          <w:bCs/>
           <w:sz w:val="24"/>
-          <w:szCs w:val="22"/>
         </w:rPr>
         <w:t xml:space="preserve">Ошибка №1: бот не отвечает, чат «молчит» после /start. </w:t>
       </w:r>
       <w:r>
         <w:rPr>
-          <w:rFonts w:ascii="Calibri" w:hAnsi="Calibri" w:eastAsia="Calibri" w:cs="Calibri" w:csTheme="minorBidi"/>
+          <w:rFonts w:ascii="Calibri" w:hAnsi="Calibri" w:eastAsia="Calibri"/>
+          <w:b w:val="0"/>
           <w:sz w:val="24"/>
-          <w:szCs w:val="22"/>
         </w:rPr>
-        <w:t>→ MVP работает, только пока запущен процесс бота. Подождите минуту и отправьте /start ещё раз. Если ответа нет, напишите тому, кто показывает демо: инстанс могли остановить.</w:t>
+        <w:t>→ MVP работает, только пока запущен процесс бота. Постоянного хостинга нет — круглосуточно держать демо нельзя. Подождите минуту и отправьте /start ещё раз. Если ответа нет, напишите программисту проекта и попросите поднять бота на время показа.</w:t>
       </w:r>
     </w:p>
     <w:p>
@@ -1355,19 +1212,17 @@
       </w:pPr>
       <w:r>
         <w:rPr>
-          <w:rFonts w:ascii="Calibri" w:hAnsi="Calibri" w:eastAsia="Calibri" w:cs="Calibri" w:csTheme="minorBidi"/>
+          <w:rFonts w:ascii="Calibri" w:hAnsi="Calibri" w:eastAsia="Calibri"/>
           <w:b/>
-          <w:bCs/>
           <w:sz w:val="24"/>
-          <w:szCs w:val="22"/>
         </w:rPr>
         <w:t xml:space="preserve">Ошибка №2: вместо пакета пришло «Не удалось обратиться к модели» или кнопка «Повторить». </w:t>
       </w:r>
       <w:r>
         <w:rPr>
-          <w:rFonts w:ascii="Calibri" w:hAnsi="Calibri" w:eastAsia="Calibri" w:cs="Calibri" w:csTheme="minorBidi"/>
+          <w:rFonts w:ascii="Calibri" w:hAnsi="Calibri" w:eastAsia="Calibri"/>
+          <w:b w:val="0"/>
           <w:sz w:val="24"/>
-          <w:szCs w:val="22"/>
         </w:rPr>
         <w:t>→ Демо ходит в бесплатный шлюз, он иногда отвечает пусто или с задержкой. Подождите полминуты и нажмите «Повторить». Не открывайте несколько копий бота сразу.</w:t>
       </w:r>
@@ -1378,19 +1233,17 @@
       </w:pPr>
       <w:r>
         <w:rPr>
-          <w:rFonts w:ascii="Calibri" w:hAnsi="Calibri" w:eastAsia="Calibri" w:cs="Calibri" w:csTheme="minorBidi"/>
+          <w:rFonts w:ascii="Calibri" w:hAnsi="Calibri" w:eastAsia="Calibri"/>
           <w:b/>
-          <w:bCs/>
           <w:sz w:val="24"/>
-          <w:szCs w:val="22"/>
         </w:rPr>
         <w:t xml:space="preserve">Ошибка №3: бот пишет «Нужны фото или хотя бы несколько фактов о товаре». </w:t>
       </w:r>
       <w:r>
         <w:rPr>
-          <w:rFonts w:ascii="Calibri" w:hAnsi="Calibri" w:eastAsia="Calibri" w:cs="Calibri" w:csTheme="minorBidi"/>
+          <w:rFonts w:ascii="Calibri" w:hAnsi="Calibri" w:eastAsia="Calibri"/>
+          <w:b w:val="0"/>
           <w:sz w:val="24"/>
-          <w:szCs w:val="22"/>
         </w:rPr>
         <w:t>→ Пришлите текст: что это за товар, материал, цвет, для кого. Одной фразы «вещь» мало. Фото само по себе допустимо, но факты делают текст заметно точнее.</w:t>
       </w:r>
@@ -1401,19 +1254,17 @@
       </w:pPr>
       <w:r>
         <w:rPr>
-          <w:rFonts w:ascii="Calibri" w:hAnsi="Calibri" w:eastAsia="Calibri" w:cs="Calibri" w:csTheme="minorBidi"/>
+          <w:rFonts w:ascii="Calibri" w:hAnsi="Calibri" w:eastAsia="Calibri"/>
           <w:b/>
-          <w:bCs/>
           <w:sz w:val="24"/>
-          <w:szCs w:val="22"/>
         </w:rPr>
         <w:t xml:space="preserve">Ошибка №4: генерация идёт дольше минуты. </w:t>
       </w:r>
       <w:r>
         <w:rPr>
-          <w:rFonts w:ascii="Calibri" w:hAnsi="Calibri" w:eastAsia="Calibri" w:cs="Calibri" w:csTheme="minorBidi"/>
+          <w:rFonts w:ascii="Calibri" w:hAnsi="Calibri" w:eastAsia="Calibri"/>
+          <w:b w:val="0"/>
           <w:sz w:val="24"/>
-          <w:szCs w:val="22"/>
         </w:rPr>
         <w:t>→ Не нажимайте кнопки пачкой. Дождитесь статуса или сообщения об ошибке. Если ответа нет — «Повторить» или /start.</w:t>
       </w:r>
@@ -1424,12 +1275,10 @@
       </w:pPr>
       <w:r>
         <w:rPr>
-          <w:rFonts w:ascii="Calibri" w:hAnsi="Calibri" w:eastAsia="Calibri" w:cs="Calibri" w:csTheme="majorBidi"/>
+          <w:rFonts w:ascii="Calibri" w:hAnsi="Calibri" w:eastAsia="Calibri"/>
           <w:b/>
-          <w:bCs/>
           <w:color w:val="1F3A5F"/>
           <w:sz w:val="32"/>
-          <w:szCs w:val="28"/>
         </w:rPr>
         <w:t>6. Частые вопросы (FAQ)</w:t>
       </w:r>
@@ -1440,19 +1289,17 @@
       </w:pPr>
       <w:r>
         <w:rPr>
-          <w:rFonts w:ascii="Calibri" w:hAnsi="Calibri" w:eastAsia="Calibri" w:cs="Calibri" w:csTheme="minorBidi"/>
+          <w:rFonts w:ascii="Calibri" w:hAnsi="Calibri" w:eastAsia="Calibri"/>
           <w:b/>
-          <w:bCs/>
           <w:sz w:val="24"/>
-          <w:szCs w:val="22"/>
         </w:rPr>
         <w:t xml:space="preserve">Бот сам опубликует карточку на Wildberries, Ozon или Авито? </w:t>
       </w:r>
       <w:r>
         <w:rPr>
-          <w:rFonts w:ascii="Calibri" w:hAnsi="Calibri" w:eastAsia="Calibri" w:cs="Calibri" w:csTheme="minorBidi"/>
+          <w:rFonts w:ascii="Calibri" w:hAnsi="Calibri" w:eastAsia="Calibri"/>
+          <w:b w:val="0"/>
           <w:sz w:val="24"/>
-          <w:szCs w:val="22"/>
         </w:rPr>
         <w:t>Нет. Он готовит черновик. Публикацию в кабинете селлер делает сам.</w:t>
       </w:r>
@@ -1463,19 +1310,17 @@
       </w:pPr>
       <w:r>
         <w:rPr>
-          <w:rFonts w:ascii="Calibri" w:hAnsi="Calibri" w:eastAsia="Calibri" w:cs="Calibri" w:csTheme="minorBidi"/>
+          <w:rFonts w:ascii="Calibri" w:hAnsi="Calibri" w:eastAsia="Calibri"/>
           <w:b/>
-          <w:bCs/>
           <w:sz w:val="24"/>
-          <w:szCs w:val="22"/>
         </w:rPr>
         <w:t xml:space="preserve">Нужно ли платить или вводить ключ нейросети? </w:t>
       </w:r>
       <w:r>
         <w:rPr>
-          <w:rFonts w:ascii="Calibri" w:hAnsi="Calibri" w:eastAsia="Calibri" w:cs="Calibri" w:csTheme="minorBidi"/>
+          <w:rFonts w:ascii="Calibri" w:hAnsi="Calibri" w:eastAsia="Calibri"/>
+          <w:b w:val="0"/>
           <w:sz w:val="24"/>
-          <w:szCs w:val="22"/>
         </w:rPr>
         <w:t>Для демо — нет. Сейчас стоит бесплатный шлюз, чтобы показать систему. В рабочем контуре планируется более сильная модель.</w:t>
       </w:r>
@@ -1486,19 +1331,17 @@
       </w:pPr>
       <w:r>
         <w:rPr>
-          <w:rFonts w:ascii="Calibri" w:hAnsi="Calibri" w:eastAsia="Calibri" w:cs="Calibri" w:csTheme="minorBidi"/>
+          <w:rFonts w:ascii="Calibri" w:hAnsi="Calibri" w:eastAsia="Calibri"/>
           <w:b/>
-          <w:bCs/>
           <w:sz w:val="24"/>
-          <w:szCs w:val="22"/>
         </w:rPr>
         <w:t xml:space="preserve">Обязательно ли фото? </w:t>
       </w:r>
       <w:r>
         <w:rPr>
-          <w:rFonts w:ascii="Calibri" w:hAnsi="Calibri" w:eastAsia="Calibri" w:cs="Calibri" w:csTheme="minorBidi"/>
+          <w:rFonts w:ascii="Calibri" w:hAnsi="Calibri" w:eastAsia="Calibri"/>
+          <w:b w:val="0"/>
           <w:sz w:val="24"/>
-          <w:szCs w:val="22"/>
         </w:rPr>
         <w:t>Нет. Достаточно фактов списком. Кнопка «Без фото» как раз для этого. Фото помогает сверить цвет и детали, которые вы не успели написать.</w:t>
       </w:r>
@@ -1509,19 +1352,17 @@
       </w:pPr>
       <w:r>
         <w:rPr>
-          <w:rFonts w:ascii="Calibri" w:hAnsi="Calibri" w:eastAsia="Calibri" w:cs="Calibri" w:csTheme="minorBidi"/>
+          <w:rFonts w:ascii="Calibri" w:hAnsi="Calibri" w:eastAsia="Calibri"/>
           <w:b/>
-          <w:bCs/>
           <w:sz w:val="24"/>
-          <w:szCs w:val="22"/>
         </w:rPr>
         <w:t xml:space="preserve">Бот не допишет состав и размер, если я их не указал? </w:t>
       </w:r>
       <w:r>
         <w:rPr>
-          <w:rFonts w:ascii="Calibri" w:hAnsi="Calibri" w:eastAsia="Calibri" w:cs="Calibri" w:csTheme="minorBidi"/>
+          <w:rFonts w:ascii="Calibri" w:hAnsi="Calibri" w:eastAsia="Calibri"/>
+          <w:b w:val="0"/>
           <w:sz w:val="24"/>
-          <w:szCs w:val="22"/>
         </w:rPr>
         <w:t>Да, так и задумано. Неизвестное он пропускает, а не выдумывает.</w:t>
       </w:r>
@@ -1532,19 +1373,17 @@
       </w:pPr>
       <w:r>
         <w:rPr>
-          <w:rFonts w:ascii="Calibri" w:hAnsi="Calibri" w:eastAsia="Calibri" w:cs="Calibri" w:csTheme="minorBidi"/>
+          <w:rFonts w:ascii="Calibri" w:hAnsi="Calibri" w:eastAsia="Calibri"/>
           <w:b/>
-          <w:bCs/>
           <w:sz w:val="24"/>
-          <w:szCs w:val="22"/>
         </w:rPr>
         <w:t xml:space="preserve">Можно ли сделать текст сразу на три площадки? </w:t>
       </w:r>
       <w:r>
         <w:rPr>
-          <w:rFonts w:ascii="Calibri" w:hAnsi="Calibri" w:eastAsia="Calibri" w:cs="Calibri" w:csTheme="minorBidi"/>
+          <w:rFonts w:ascii="Calibri" w:hAnsi="Calibri" w:eastAsia="Calibri"/>
+          <w:b w:val="0"/>
           <w:sz w:val="24"/>
-          <w:szCs w:val="22"/>
         </w:rPr>
         <w:t>Да. Сначала соберите пакет на одной, затем «Другая площадка» — факты вводить заново не нужно.</w:t>
       </w:r>
@@ -1555,12 +1394,11 @@
       </w:pPr>
       <w:r>
         <w:rPr>
-          <w:rFonts w:ascii="Calibri" w:hAnsi="Calibri" w:eastAsia="Calibri" w:cs="Calibri" w:csTheme="minorBidi"/>
+          <w:rFonts w:ascii="Calibri" w:hAnsi="Calibri" w:eastAsia="Calibri"/>
+          <w:b w:val="0"/>
           <w:i/>
-          <w:iCs/>
           <w:color w:val="5A6A7A"/>
           <w:sz w:val="20"/>
-          <w:szCs w:val="22"/>
         </w:rPr>
         <w:t>Рисунки 2–7 воспроизводят реальные тексты и кнопки диалога SEO Seller. Рисунок 1 — живая страница https://t.me/CardSEO_bot.</w:t>
       </w:r>
@@ -1568,6 +1406,7 @@
     <w:sectPr>
       <w:pgSz w:w="12240" w:h="15840"/>
       <w:pgMar w:top="1134" w:right="1247" w:bottom="1134" w:left="1247" w:header="720" w:footer="720" w:gutter="0"/>
+      <w:cols w:space="720"/>
       <w:docGrid w:linePitch="360"/>
     </w:sectPr>
   </w:body>

</xml_diff>